<commit_message>
feat: add dynamic footer page numbering and synchronize Table of Contents with exact page locations
</commit_message>
<xml_diff>
--- a/reports/published/ARIA_Dissertation_MSc_Data_Science.docx
+++ b/reports/published/ARIA_Dissertation_MSc_Data_Science.docx
@@ -653,7 +653,7 @@
                 <w:color w:val="1F2937"/>
                 <w:sz w:val="20"/>
               </w:rPr>
-              <w:t>ii</w:t>
+              <w:t>2</w:t>
             </w:r>
           </w:p>
         </w:tc>
@@ -719,7 +719,7 @@
                 <w:color w:val="1F2937"/>
                 <w:sz w:val="20"/>
               </w:rPr>
-              <w:t>iii</w:t>
+              <w:t>3</w:t>
             </w:r>
           </w:p>
         </w:tc>
@@ -785,7 +785,7 @@
                 <w:color w:val="1F2937"/>
                 <w:sz w:val="20"/>
               </w:rPr>
-              <w:t>iv</w:t>
+              <w:t>4</w:t>
             </w:r>
           </w:p>
         </w:tc>
@@ -851,7 +851,7 @@
                 <w:color w:val="1F2937"/>
                 <w:sz w:val="20"/>
               </w:rPr>
-              <w:t>v</w:t>
+              <w:t>5</w:t>
             </w:r>
           </w:p>
         </w:tc>
@@ -917,7 +917,7 @@
                 <w:color w:val="1F2937"/>
                 <w:sz w:val="20"/>
               </w:rPr>
-              <w:t>vii</w:t>
+              <w:t>8</w:t>
             </w:r>
           </w:p>
         </w:tc>
@@ -983,7 +983,7 @@
                 <w:color w:val="1F2937"/>
                 <w:sz w:val="20"/>
               </w:rPr>
-              <w:t>viii</w:t>
+              <w:t>8</w:t>
             </w:r>
           </w:p>
         </w:tc>
@@ -1049,7 +1049,7 @@
                 <w:color w:val="1F2937"/>
                 <w:sz w:val="20"/>
               </w:rPr>
-              <w:t>ix</w:t>
+              <w:t>9</w:t>
             </w:r>
           </w:p>
         </w:tc>
@@ -1115,7 +1115,7 @@
                 <w:color w:val="1F2937"/>
                 <w:sz w:val="20"/>
               </w:rPr>
-              <w:t>1</w:t>
+              <w:t>10</w:t>
             </w:r>
           </w:p>
         </w:tc>
@@ -1181,7 +1181,7 @@
                 <w:color w:val="1F2937"/>
                 <w:sz w:val="20"/>
               </w:rPr>
-              <w:t>1</w:t>
+              <w:t>10</w:t>
             </w:r>
           </w:p>
         </w:tc>
@@ -1247,7 +1247,7 @@
                 <w:color w:val="1F2937"/>
                 <w:sz w:val="20"/>
               </w:rPr>
-              <w:t>2</w:t>
+              <w:t>10</w:t>
             </w:r>
           </w:p>
         </w:tc>
@@ -1313,7 +1313,7 @@
                 <w:color w:val="1F2937"/>
                 <w:sz w:val="20"/>
               </w:rPr>
-              <w:t>3</w:t>
+              <w:t>11</w:t>
             </w:r>
           </w:p>
         </w:tc>
@@ -1379,7 +1379,7 @@
                 <w:color w:val="1F2937"/>
                 <w:sz w:val="20"/>
               </w:rPr>
-              <w:t>4</w:t>
+              <w:t>12</w:t>
             </w:r>
           </w:p>
         </w:tc>
@@ -1445,7 +1445,7 @@
                 <w:color w:val="1F2937"/>
                 <w:sz w:val="20"/>
               </w:rPr>
-              <w:t>4</w:t>
+              <w:t>12</w:t>
             </w:r>
           </w:p>
         </w:tc>
@@ -1511,7 +1511,7 @@
                 <w:color w:val="1F2937"/>
                 <w:sz w:val="20"/>
               </w:rPr>
-              <w:t>5</w:t>
+              <w:t>14</w:t>
             </w:r>
           </w:p>
         </w:tc>
@@ -1577,7 +1577,7 @@
                 <w:color w:val="1F2937"/>
                 <w:sz w:val="20"/>
               </w:rPr>
-              <w:t>5</w:t>
+              <w:t>14</w:t>
             </w:r>
           </w:p>
         </w:tc>
@@ -1643,7 +1643,7 @@
                 <w:color w:val="1F2937"/>
                 <w:sz w:val="20"/>
               </w:rPr>
-              <w:t>7</w:t>
+              <w:t>15</w:t>
             </w:r>
           </w:p>
         </w:tc>
@@ -1709,7 +1709,7 @@
                 <w:color w:val="1F2937"/>
                 <w:sz w:val="20"/>
               </w:rPr>
-              <w:t>8</w:t>
+              <w:t>15</w:t>
             </w:r>
           </w:p>
         </w:tc>
@@ -1775,7 +1775,7 @@
                 <w:color w:val="1F2937"/>
                 <w:sz w:val="20"/>
               </w:rPr>
-              <w:t>10</w:t>
+              <w:t>18</w:t>
             </w:r>
           </w:p>
         </w:tc>
@@ -1809,7 +1809,7 @@
                 <w:color w:val="1F2937"/>
                 <w:sz w:val="20"/>
               </w:rPr>
-              <w:t xml:space="preserve">   2.5 Invariant Enforcement: Zero Leakage and Clean Typography</w:t>
+              <w:t xml:space="preserve">       2.4.2 Mathematical Formalization of Council Gating Function</w:t>
             </w:r>
           </w:p>
         </w:tc>
@@ -1841,7 +1841,7 @@
                 <w:color w:val="1F2937"/>
                 <w:sz w:val="20"/>
               </w:rPr>
-              <w:t>12</w:t>
+              <w:t>19</w:t>
             </w:r>
           </w:p>
         </w:tc>
@@ -1875,7 +1875,7 @@
                 <w:color w:val="1F2937"/>
                 <w:sz w:val="20"/>
               </w:rPr>
-              <w:t>CHAPTER 3: IMPLEMENTATION, METHODOLOGY &amp; EXPERIMENTAL EVALUATION</w:t>
+              <w:t xml:space="preserve">   2.5 Invariant Enforcement: Zero Leakage and Clean Typography</w:t>
             </w:r>
           </w:p>
         </w:tc>
@@ -1907,7 +1907,7 @@
                 <w:color w:val="1F2937"/>
                 <w:sz w:val="20"/>
               </w:rPr>
-              <w:t>13</w:t>
+              <w:t>20</w:t>
             </w:r>
           </w:p>
         </w:tc>
@@ -1941,7 +1941,7 @@
                 <w:color w:val="1F2937"/>
                 <w:sz w:val="20"/>
               </w:rPr>
-              <w:t xml:space="preserve">   3.1 Software Architecture &amp; Reproducible Execution Pipeline</w:t>
+              <w:t xml:space="preserve">   2.6 Formalization of Invariant Mathematical Contracts</w:t>
             </w:r>
           </w:p>
         </w:tc>
@@ -1973,7 +1973,7 @@
                 <w:color w:val="1F2937"/>
                 <w:sz w:val="20"/>
               </w:rPr>
-              <w:t>13</w:t>
+              <w:t>21</w:t>
             </w:r>
           </w:p>
         </w:tc>
@@ -2007,7 +2007,7 @@
                 <w:color w:val="1F2937"/>
                 <w:sz w:val="20"/>
               </w:rPr>
-              <w:t xml:space="preserve">   3.2 Experimental Setup &amp; Benchmark Datasets</w:t>
+              <w:t>CHAPTER 3: IMPLEMENTATION, METHODOLOGY &amp; EXPERIMENTAL EVALUATION</w:t>
             </w:r>
           </w:p>
         </w:tc>
@@ -2039,7 +2039,7 @@
                 <w:color w:val="1F2937"/>
                 <w:sz w:val="20"/>
               </w:rPr>
-              <w:t>14</w:t>
+              <w:t>22</w:t>
             </w:r>
           </w:p>
         </w:tc>
@@ -2073,7 +2073,7 @@
                 <w:color w:val="1F2937"/>
                 <w:sz w:val="20"/>
               </w:rPr>
-              <w:t xml:space="preserve">   3.3 Multi-Agent Ablation Analysis: Single-Agent vs. Council Debate</w:t>
+              <w:t xml:space="preserve">   3.1 Software Architecture &amp; Reproducible Execution Pipeline</w:t>
             </w:r>
           </w:p>
         </w:tc>
@@ -2105,7 +2105,7 @@
                 <w:color w:val="1F2937"/>
                 <w:sz w:val="20"/>
               </w:rPr>
-              <w:t>15</w:t>
+              <w:t>22</w:t>
             </w:r>
           </w:p>
         </w:tc>
@@ -2139,7 +2139,7 @@
                 <w:color w:val="1F2937"/>
                 <w:sz w:val="20"/>
               </w:rPr>
-              <w:t xml:space="preserve">   3.4 Signal Extraction &amp; High-Order Feature Engineering Impact</w:t>
+              <w:t xml:space="preserve">   3.2 Experimental Setup &amp; Benchmark Datasets</w:t>
             </w:r>
           </w:p>
         </w:tc>
@@ -2171,7 +2171,7 @@
                 <w:color w:val="1F2937"/>
                 <w:sz w:val="20"/>
               </w:rPr>
-              <w:t>16</w:t>
+              <w:t>22</w:t>
             </w:r>
           </w:p>
         </w:tc>
@@ -2205,7 +2205,7 @@
                 <w:color w:val="1F2937"/>
                 <w:sz w:val="20"/>
               </w:rPr>
-              <w:t xml:space="preserve">   3.5 Model Tournament &amp; Optuna Bayesian Optimization Trajectories</w:t>
+              <w:t xml:space="preserve">   3.3 Multi-Agent Ablation Analysis: Single-Agent vs. Council Debate</w:t>
             </w:r>
           </w:p>
         </w:tc>
@@ -2237,7 +2237,7 @@
                 <w:color w:val="1F2937"/>
                 <w:sz w:val="20"/>
               </w:rPr>
-              <w:t>17</w:t>
+              <w:t>23</w:t>
             </w:r>
           </w:p>
         </w:tc>
@@ -2271,7 +2271,7 @@
                 <w:color w:val="1F2937"/>
                 <w:sz w:val="20"/>
               </w:rPr>
-              <w:t xml:space="preserve">   3.6 Model Governance, SHAP Attribution &amp; Cohort Fairness Auditing</w:t>
+              <w:t xml:space="preserve">   3.4 Signal Extraction &amp; High-Order Feature Engineering Impact</w:t>
             </w:r>
           </w:p>
         </w:tc>
@@ -2303,7 +2303,7 @@
                 <w:color w:val="1F2937"/>
                 <w:sz w:val="20"/>
               </w:rPr>
-              <w:t>18</w:t>
+              <w:t>24</w:t>
             </w:r>
           </w:p>
         </w:tc>
@@ -2337,7 +2337,7 @@
                 <w:color w:val="1F2937"/>
                 <w:sz w:val="20"/>
               </w:rPr>
-              <w:t>CHAPTER 4: CONCLUSION, FUTURE SCOPE &amp; REFERENCES</w:t>
+              <w:t xml:space="preserve">       3.4.2 Intersectional Demographic Signal Analysis: Titanic Benchmark</w:t>
             </w:r>
           </w:p>
         </w:tc>
@@ -2369,7 +2369,7 @@
                 <w:color w:val="1F2937"/>
                 <w:sz w:val="20"/>
               </w:rPr>
-              <w:t>19</w:t>
+              <w:t>25</w:t>
             </w:r>
           </w:p>
         </w:tc>
@@ -2403,7 +2403,7 @@
                 <w:color w:val="1F2937"/>
                 <w:sz w:val="20"/>
               </w:rPr>
-              <w:t xml:space="preserve">   4.1 Summary of Scientific Contributions</w:t>
+              <w:t xml:space="preserve">   3.5 Model Tournament &amp; Optuna Bayesian Optimization Trajectories</w:t>
             </w:r>
           </w:p>
         </w:tc>
@@ -2435,7 +2435,7 @@
                 <w:color w:val="1F2937"/>
                 <w:sz w:val="20"/>
               </w:rPr>
-              <w:t>19</w:t>
+              <w:t>26</w:t>
             </w:r>
           </w:p>
         </w:tc>
@@ -2469,7 +2469,7 @@
                 <w:color w:val="1F2937"/>
                 <w:sz w:val="20"/>
               </w:rPr>
-              <w:t xml:space="preserve">   4.2 Industry Implications &amp; Enterprise MLOps Integration</w:t>
+              <w:t xml:space="preserve">       3.5.2 Hyperparameter Topologies &amp; Optuna Trajectories</w:t>
             </w:r>
           </w:p>
         </w:tc>
@@ -2501,7 +2501,7 @@
                 <w:color w:val="1F2937"/>
                 <w:sz w:val="20"/>
               </w:rPr>
-              <w:t>19</w:t>
+              <w:t>26</w:t>
             </w:r>
           </w:p>
         </w:tc>
@@ -2535,7 +2535,7 @@
                 <w:color w:val="1F2937"/>
                 <w:sz w:val="20"/>
               </w:rPr>
-              <w:t xml:space="preserve">   4.3 Limitations &amp; Failure Mode Analysis</w:t>
+              <w:t xml:space="preserve">   3.6 Model Governance, SHAP Attribution &amp; Cohort Fairness Auditing</w:t>
             </w:r>
           </w:p>
         </w:tc>
@@ -2567,7 +2567,7 @@
                 <w:color w:val="1F2937"/>
                 <w:sz w:val="20"/>
               </w:rPr>
-              <w:t>20</w:t>
+              <w:t>27</w:t>
             </w:r>
           </w:p>
         </w:tc>
@@ -2601,7 +2601,7 @@
                 <w:color w:val="1F2937"/>
                 <w:sz w:val="20"/>
               </w:rPr>
-              <w:t xml:space="preserve">   4.4 Future Directions &amp; Research Roadmap</w:t>
+              <w:t>CHAPTER 4: CONCLUSION, FUTURE SCOPE &amp; REFERENCES</w:t>
             </w:r>
           </w:p>
         </w:tc>
@@ -2633,7 +2633,7 @@
                 <w:color w:val="1F2937"/>
                 <w:sz w:val="20"/>
               </w:rPr>
-              <w:t>20</w:t>
+              <w:t>28</w:t>
             </w:r>
           </w:p>
         </w:tc>
@@ -2667,7 +2667,7 @@
                 <w:color w:val="1F2937"/>
                 <w:sz w:val="20"/>
               </w:rPr>
-              <w:t xml:space="preserve">   4.5 Academic References</w:t>
+              <w:t xml:space="preserve">   4.1 Summary of Scientific Contributions</w:t>
             </w:r>
           </w:p>
         </w:tc>
@@ -2699,7 +2699,7 @@
                 <w:color w:val="1F2937"/>
                 <w:sz w:val="20"/>
               </w:rPr>
-              <w:t>21</w:t>
+              <w:t>28</w:t>
             </w:r>
           </w:p>
         </w:tc>
@@ -2733,7 +2733,7 @@
                 <w:color w:val="1F2937"/>
                 <w:sz w:val="20"/>
               </w:rPr>
-              <w:t>APPENDIX: SYSTEM PROMPTS, MATHEMATICAL SPECIFICATIONS &amp; ARTIFACTS</w:t>
+              <w:t xml:space="preserve">   4.2 Practical Implications for Enterprise Analytics &amp; MLOps</w:t>
             </w:r>
           </w:p>
         </w:tc>
@@ -2765,7 +2765,271 @@
                 <w:color w:val="1F2937"/>
                 <w:sz w:val="20"/>
               </w:rPr>
-              <w:t>22</w:t>
+              <w:t>28</w:t>
+            </w:r>
+          </w:p>
+        </w:tc>
+      </w:tr>
+      <w:tr>
+        <w:tc>
+          <w:tcPr>
+            <w:tcW w:type="dxa" w:w="7200"/>
+            <w:shd w:fill="F8FAFC"/>
+            <w:tcMar>
+              <w:top w:w="90" w:type="dxa"/>
+              <w:bottom w:w="90" w:type="dxa"/>
+              <w:left w:w="120" w:type="dxa"/>
+              <w:right w:w="120" w:type="dxa"/>
+            </w:tcMar>
+            <w:tcBorders>
+              <w:top w:val="single" w:sz="4" w:space="0" w:color="E2E8F0"/>
+              <w:left w:val="single" w:sz="4" w:space="0" w:color="E2E8F0"/>
+              <w:bottom w:val="single" w:sz="4" w:space="0" w:color="E2E8F0"/>
+              <w:right w:val="single" w:sz="4" w:space="0" w:color="E2E8F0"/>
+            </w:tcBorders>
+          </w:tcPr>
+          <w:p>
+            <w:pPr>
+              <w:spacing w:after="0" w:line="276" w:lineRule="auto"/>
+              <w:jc w:val="left"/>
+            </w:pPr>
+            <w:r>
+              <w:rPr>
+                <w:rFonts w:ascii="Times New Roman" w:hAnsi="Times New Roman"/>
+                <w:color w:val="1F2937"/>
+                <w:sz w:val="20"/>
+              </w:rPr>
+              <w:t xml:space="preserve">   4.3 Limitations &amp; Failure Mode Analysis</w:t>
+            </w:r>
+          </w:p>
+        </w:tc>
+        <w:tc>
+          <w:tcPr>
+            <w:tcW w:type="dxa" w:w="1829"/>
+            <w:shd w:fill="F8FAFC"/>
+            <w:tcMar>
+              <w:top w:w="90" w:type="dxa"/>
+              <w:bottom w:w="90" w:type="dxa"/>
+              <w:left w:w="120" w:type="dxa"/>
+              <w:right w:w="120" w:type="dxa"/>
+            </w:tcMar>
+            <w:tcBorders>
+              <w:top w:val="single" w:sz="4" w:space="0" w:color="E2E8F0"/>
+              <w:left w:val="single" w:sz="4" w:space="0" w:color="E2E8F0"/>
+              <w:bottom w:val="single" w:sz="4" w:space="0" w:color="E2E8F0"/>
+              <w:right w:val="single" w:sz="4" w:space="0" w:color="E2E8F0"/>
+            </w:tcBorders>
+          </w:tcPr>
+          <w:p>
+            <w:pPr>
+              <w:spacing w:after="0" w:line="276" w:lineRule="auto"/>
+              <w:jc w:val="center"/>
+            </w:pPr>
+            <w:r>
+              <w:rPr>
+                <w:rFonts w:ascii="Times New Roman" w:hAnsi="Times New Roman"/>
+                <w:color w:val="1F2937"/>
+                <w:sz w:val="20"/>
+              </w:rPr>
+              <w:t>29</w:t>
+            </w:r>
+          </w:p>
+        </w:tc>
+      </w:tr>
+      <w:tr>
+        <w:tc>
+          <w:tcPr>
+            <w:tcW w:type="dxa" w:w="7200"/>
+            <w:shd w:fill="FFFFFF"/>
+            <w:tcMar>
+              <w:top w:w="90" w:type="dxa"/>
+              <w:bottom w:w="90" w:type="dxa"/>
+              <w:left w:w="120" w:type="dxa"/>
+              <w:right w:w="120" w:type="dxa"/>
+            </w:tcMar>
+            <w:tcBorders>
+              <w:top w:val="single" w:sz="4" w:space="0" w:color="E2E8F0"/>
+              <w:left w:val="single" w:sz="4" w:space="0" w:color="E2E8F0"/>
+              <w:bottom w:val="single" w:sz="4" w:space="0" w:color="E2E8F0"/>
+              <w:right w:val="single" w:sz="4" w:space="0" w:color="E2E8F0"/>
+            </w:tcBorders>
+          </w:tcPr>
+          <w:p>
+            <w:pPr>
+              <w:spacing w:after="0" w:line="276" w:lineRule="auto"/>
+              <w:jc w:val="left"/>
+            </w:pPr>
+            <w:r>
+              <w:rPr>
+                <w:rFonts w:ascii="Times New Roman" w:hAnsi="Times New Roman"/>
+                <w:color w:val="1F2937"/>
+                <w:sz w:val="20"/>
+              </w:rPr>
+              <w:t xml:space="preserve">   4.4 Future Directions &amp; Research Roadmap</w:t>
+            </w:r>
+          </w:p>
+        </w:tc>
+        <w:tc>
+          <w:tcPr>
+            <w:tcW w:type="dxa" w:w="1829"/>
+            <w:shd w:fill="FFFFFF"/>
+            <w:tcMar>
+              <w:top w:w="90" w:type="dxa"/>
+              <w:bottom w:w="90" w:type="dxa"/>
+              <w:left w:w="120" w:type="dxa"/>
+              <w:right w:w="120" w:type="dxa"/>
+            </w:tcMar>
+            <w:tcBorders>
+              <w:top w:val="single" w:sz="4" w:space="0" w:color="E2E8F0"/>
+              <w:left w:val="single" w:sz="4" w:space="0" w:color="E2E8F0"/>
+              <w:bottom w:val="single" w:sz="4" w:space="0" w:color="E2E8F0"/>
+              <w:right w:val="single" w:sz="4" w:space="0" w:color="E2E8F0"/>
+            </w:tcBorders>
+          </w:tcPr>
+          <w:p>
+            <w:pPr>
+              <w:spacing w:after="0" w:line="276" w:lineRule="auto"/>
+              <w:jc w:val="center"/>
+            </w:pPr>
+            <w:r>
+              <w:rPr>
+                <w:rFonts w:ascii="Times New Roman" w:hAnsi="Times New Roman"/>
+                <w:color w:val="1F2937"/>
+                <w:sz w:val="20"/>
+              </w:rPr>
+              <w:t>29</w:t>
+            </w:r>
+          </w:p>
+        </w:tc>
+      </w:tr>
+      <w:tr>
+        <w:tc>
+          <w:tcPr>
+            <w:tcW w:type="dxa" w:w="7200"/>
+            <w:shd w:fill="F8FAFC"/>
+            <w:tcMar>
+              <w:top w:w="90" w:type="dxa"/>
+              <w:bottom w:w="90" w:type="dxa"/>
+              <w:left w:w="120" w:type="dxa"/>
+              <w:right w:w="120" w:type="dxa"/>
+            </w:tcMar>
+            <w:tcBorders>
+              <w:top w:val="single" w:sz="4" w:space="0" w:color="E2E8F0"/>
+              <w:left w:val="single" w:sz="4" w:space="0" w:color="E2E8F0"/>
+              <w:bottom w:val="single" w:sz="4" w:space="0" w:color="E2E8F0"/>
+              <w:right w:val="single" w:sz="4" w:space="0" w:color="E2E8F0"/>
+            </w:tcBorders>
+          </w:tcPr>
+          <w:p>
+            <w:pPr>
+              <w:spacing w:after="0" w:line="276" w:lineRule="auto"/>
+              <w:jc w:val="left"/>
+            </w:pPr>
+            <w:r>
+              <w:rPr>
+                <w:rFonts w:ascii="Times New Roman" w:hAnsi="Times New Roman"/>
+                <w:color w:val="1F2937"/>
+                <w:sz w:val="20"/>
+              </w:rPr>
+              <w:t xml:space="preserve">   4.5 Academic References</w:t>
+            </w:r>
+          </w:p>
+        </w:tc>
+        <w:tc>
+          <w:tcPr>
+            <w:tcW w:type="dxa" w:w="1829"/>
+            <w:shd w:fill="F8FAFC"/>
+            <w:tcMar>
+              <w:top w:w="90" w:type="dxa"/>
+              <w:bottom w:w="90" w:type="dxa"/>
+              <w:left w:w="120" w:type="dxa"/>
+              <w:right w:w="120" w:type="dxa"/>
+            </w:tcMar>
+            <w:tcBorders>
+              <w:top w:val="single" w:sz="4" w:space="0" w:color="E2E8F0"/>
+              <w:left w:val="single" w:sz="4" w:space="0" w:color="E2E8F0"/>
+              <w:bottom w:val="single" w:sz="4" w:space="0" w:color="E2E8F0"/>
+              <w:right w:val="single" w:sz="4" w:space="0" w:color="E2E8F0"/>
+            </w:tcBorders>
+          </w:tcPr>
+          <w:p>
+            <w:pPr>
+              <w:spacing w:after="0" w:line="276" w:lineRule="auto"/>
+              <w:jc w:val="center"/>
+            </w:pPr>
+            <w:r>
+              <w:rPr>
+                <w:rFonts w:ascii="Times New Roman" w:hAnsi="Times New Roman"/>
+                <w:color w:val="1F2937"/>
+                <w:sz w:val="20"/>
+              </w:rPr>
+              <w:t>30</w:t>
+            </w:r>
+          </w:p>
+        </w:tc>
+      </w:tr>
+      <w:tr>
+        <w:tc>
+          <w:tcPr>
+            <w:tcW w:type="dxa" w:w="7200"/>
+            <w:shd w:fill="FFFFFF"/>
+            <w:tcMar>
+              <w:top w:w="90" w:type="dxa"/>
+              <w:bottom w:w="90" w:type="dxa"/>
+              <w:left w:w="120" w:type="dxa"/>
+              <w:right w:w="120" w:type="dxa"/>
+            </w:tcMar>
+            <w:tcBorders>
+              <w:top w:val="single" w:sz="4" w:space="0" w:color="E2E8F0"/>
+              <w:left w:val="single" w:sz="4" w:space="0" w:color="E2E8F0"/>
+              <w:bottom w:val="single" w:sz="4" w:space="0" w:color="E2E8F0"/>
+              <w:right w:val="single" w:sz="4" w:space="0" w:color="E2E8F0"/>
+            </w:tcBorders>
+          </w:tcPr>
+          <w:p>
+            <w:pPr>
+              <w:spacing w:after="0" w:line="276" w:lineRule="auto"/>
+              <w:jc w:val="left"/>
+            </w:pPr>
+            <w:r>
+              <w:rPr>
+                <w:rFonts w:ascii="Times New Roman" w:hAnsi="Times New Roman"/>
+                <w:color w:val="1F2937"/>
+                <w:sz w:val="20"/>
+              </w:rPr>
+              <w:t>APPENDIX: SYSTEM PROMPTS, MATHEMATICAL SPECIFICATIONS &amp; ARTIFACTS</w:t>
+            </w:r>
+          </w:p>
+        </w:tc>
+        <w:tc>
+          <w:tcPr>
+            <w:tcW w:type="dxa" w:w="1829"/>
+            <w:shd w:fill="FFFFFF"/>
+            <w:tcMar>
+              <w:top w:w="90" w:type="dxa"/>
+              <w:bottom w:w="90" w:type="dxa"/>
+              <w:left w:w="120" w:type="dxa"/>
+              <w:right w:w="120" w:type="dxa"/>
+            </w:tcMar>
+            <w:tcBorders>
+              <w:top w:val="single" w:sz="4" w:space="0" w:color="E2E8F0"/>
+              <w:left w:val="single" w:sz="4" w:space="0" w:color="E2E8F0"/>
+              <w:bottom w:val="single" w:sz="4" w:space="0" w:color="E2E8F0"/>
+              <w:right w:val="single" w:sz="4" w:space="0" w:color="E2E8F0"/>
+            </w:tcBorders>
+          </w:tcPr>
+          <w:p>
+            <w:pPr>
+              <w:spacing w:after="0" w:line="276" w:lineRule="auto"/>
+              <w:jc w:val="center"/>
+            </w:pPr>
+            <w:r>
+              <w:rPr>
+                <w:rFonts w:ascii="Times New Roman" w:hAnsi="Times New Roman"/>
+                <w:color w:val="1F2937"/>
+                <w:sz w:val="20"/>
+              </w:rPr>
+              <w:t>31</w:t>
             </w:r>
           </w:p>
         </w:tc>
@@ -3002,7 +3266,7 @@
                 <w:color w:val="1F2937"/>
                 <w:sz w:val="20"/>
               </w:rPr>
-              <w:t>6</w:t>
+              <w:t>14</w:t>
             </w:r>
           </w:p>
         </w:tc>
@@ -3100,7 +3364,7 @@
                 <w:color w:val="1F2937"/>
                 <w:sz w:val="20"/>
               </w:rPr>
-              <w:t>11</w:t>
+              <w:t>18</w:t>
             </w:r>
           </w:p>
         </w:tc>
@@ -3198,7 +3462,7 @@
                 <w:color w:val="1F2937"/>
                 <w:sz w:val="20"/>
               </w:rPr>
-              <w:t>14</w:t>
+              <w:t>22</w:t>
             </w:r>
           </w:p>
         </w:tc>
@@ -3296,7 +3560,7 @@
                 <w:color w:val="1F2937"/>
                 <w:sz w:val="20"/>
               </w:rPr>
-              <w:t>17</w:t>
+              <w:t>26</w:t>
             </w:r>
           </w:p>
         </w:tc>
@@ -3394,7 +3658,7 @@
                 <w:color w:val="1F2937"/>
                 <w:sz w:val="20"/>
               </w:rPr>
-              <w:t>18</w:t>
+              <w:t>27</w:t>
             </w:r>
           </w:p>
         </w:tc>
@@ -3492,7 +3756,7 @@
                 <w:color w:val="1F2937"/>
                 <w:sz w:val="20"/>
               </w:rPr>
-              <w:t>18</w:t>
+              <w:t>27</w:t>
             </w:r>
           </w:p>
         </w:tc>
@@ -3724,7 +3988,7 @@
                 <w:color w:val="1F2937"/>
                 <w:sz w:val="20"/>
               </w:rPr>
-              <w:t>2</w:t>
+              <w:t>11</w:t>
             </w:r>
           </w:p>
         </w:tc>
@@ -3822,7 +4086,7 @@
                 <w:color w:val="1F2937"/>
                 <w:sz w:val="20"/>
               </w:rPr>
-              <w:t>9</w:t>
+              <w:t>17</w:t>
             </w:r>
           </w:p>
         </w:tc>
@@ -3920,7 +4184,7 @@
                 <w:color w:val="1F2937"/>
                 <w:sz w:val="20"/>
               </w:rPr>
-              <w:t>11</w:t>
+              <w:t>19</w:t>
             </w:r>
           </w:p>
         </w:tc>
@@ -4018,7 +4282,7 @@
                 <w:color w:val="1F2937"/>
                 <w:sz w:val="20"/>
               </w:rPr>
-              <w:t>14</w:t>
+              <w:t>22</w:t>
             </w:r>
           </w:p>
         </w:tc>
@@ -4116,7 +4380,7 @@
                 <w:color w:val="1F2937"/>
                 <w:sz w:val="20"/>
               </w:rPr>
-              <w:t>15</w:t>
+              <w:t>23</w:t>
             </w:r>
           </w:p>
         </w:tc>
@@ -4214,7 +4478,7 @@
                 <w:color w:val="1F2937"/>
                 <w:sz w:val="20"/>
               </w:rPr>
-              <w:t>16</w:t>
+              <w:t>24</w:t>
             </w:r>
           </w:p>
         </w:tc>
@@ -4248,7 +4512,7 @@
                 <w:color w:val="1F2937"/>
                 <w:sz w:val="20"/>
               </w:rPr>
-              <w:t>Table 3.4</w:t>
+              <w:t>Table 3.3B</w:t>
             </w:r>
           </w:p>
         </w:tc>
@@ -4280,7 +4544,7 @@
                 <w:color w:val="1F2937"/>
                 <w:sz w:val="20"/>
               </w:rPr>
-              <w:t>Comprehensive Multi-Model Algorithm Tournament Performance</w:t>
+              <w:t>Titanic Demographic Survival Interaction Matrix</w:t>
             </w:r>
           </w:p>
         </w:tc>
@@ -4312,7 +4576,7 @@
                 <w:color w:val="1F2937"/>
                 <w:sz w:val="20"/>
               </w:rPr>
-              <w:t>17</w:t>
+              <w:t>25</w:t>
             </w:r>
           </w:p>
         </w:tc>
@@ -4346,7 +4610,7 @@
                 <w:color w:val="1F2937"/>
                 <w:sz w:val="20"/>
               </w:rPr>
-              <w:t>Table 3.5</w:t>
+              <w:t>Table 3.4</w:t>
             </w:r>
           </w:p>
         </w:tc>
@@ -4378,7 +4642,7 @@
                 <w:color w:val="1F2937"/>
                 <w:sz w:val="20"/>
               </w:rPr>
-              <w:t>Optuna Bayesian Optimization Search Hypercube Bounds</w:t>
+              <w:t>Comprehensive Multi-Model Algorithm Tournament Performance</w:t>
             </w:r>
           </w:p>
         </w:tc>
@@ -4410,7 +4674,105 @@
                 <w:color w:val="1F2937"/>
                 <w:sz w:val="20"/>
               </w:rPr>
-              <w:t>18</w:t>
+              <w:t>26</w:t>
+            </w:r>
+          </w:p>
+        </w:tc>
+      </w:tr>
+      <w:tr>
+        <w:tc>
+          <w:tcPr>
+            <w:tcW w:type="dxa" w:w="1728"/>
+            <w:shd w:fill="FFFFFF"/>
+            <w:tcMar>
+              <w:top w:w="90" w:type="dxa"/>
+              <w:bottom w:w="90" w:type="dxa"/>
+              <w:left w:w="120" w:type="dxa"/>
+              <w:right w:w="120" w:type="dxa"/>
+            </w:tcMar>
+            <w:tcBorders>
+              <w:top w:val="single" w:sz="4" w:space="0" w:color="E2E8F0"/>
+              <w:left w:val="single" w:sz="4" w:space="0" w:color="E2E8F0"/>
+              <w:bottom w:val="single" w:sz="4" w:space="0" w:color="E2E8F0"/>
+              <w:right w:val="single" w:sz="4" w:space="0" w:color="E2E8F0"/>
+            </w:tcBorders>
+          </w:tcPr>
+          <w:p>
+            <w:pPr>
+              <w:spacing w:after="0" w:line="276" w:lineRule="auto"/>
+              <w:jc w:val="left"/>
+            </w:pPr>
+            <w:r>
+              <w:rPr>
+                <w:rFonts w:ascii="Times New Roman" w:hAnsi="Times New Roman"/>
+                <w:color w:val="1F2937"/>
+                <w:sz w:val="20"/>
+              </w:rPr>
+              <w:t>Table 3.5</w:t>
+            </w:r>
+          </w:p>
+        </w:tc>
+        <w:tc>
+          <w:tcPr>
+            <w:tcW w:type="dxa" w:w="5760"/>
+            <w:shd w:fill="FFFFFF"/>
+            <w:tcMar>
+              <w:top w:w="90" w:type="dxa"/>
+              <w:bottom w:w="90" w:type="dxa"/>
+              <w:left w:w="120" w:type="dxa"/>
+              <w:right w:w="120" w:type="dxa"/>
+            </w:tcMar>
+            <w:tcBorders>
+              <w:top w:val="single" w:sz="4" w:space="0" w:color="E2E8F0"/>
+              <w:left w:val="single" w:sz="4" w:space="0" w:color="E2E8F0"/>
+              <w:bottom w:val="single" w:sz="4" w:space="0" w:color="E2E8F0"/>
+              <w:right w:val="single" w:sz="4" w:space="0" w:color="E2E8F0"/>
+            </w:tcBorders>
+          </w:tcPr>
+          <w:p>
+            <w:pPr>
+              <w:spacing w:after="0" w:line="276" w:lineRule="auto"/>
+              <w:jc w:val="center"/>
+            </w:pPr>
+            <w:r>
+              <w:rPr>
+                <w:rFonts w:ascii="Times New Roman" w:hAnsi="Times New Roman"/>
+                <w:color w:val="1F2937"/>
+                <w:sz w:val="20"/>
+              </w:rPr>
+              <w:t>Optuna Bayesian Optimization Search Hypercube Bounds</w:t>
+            </w:r>
+          </w:p>
+        </w:tc>
+        <w:tc>
+          <w:tcPr>
+            <w:tcW w:type="dxa" w:w="1541"/>
+            <w:shd w:fill="FFFFFF"/>
+            <w:tcMar>
+              <w:top w:w="90" w:type="dxa"/>
+              <w:bottom w:w="90" w:type="dxa"/>
+              <w:left w:w="120" w:type="dxa"/>
+              <w:right w:w="120" w:type="dxa"/>
+            </w:tcMar>
+            <w:tcBorders>
+              <w:top w:val="single" w:sz="4" w:space="0" w:color="E2E8F0"/>
+              <w:left w:val="single" w:sz="4" w:space="0" w:color="E2E8F0"/>
+              <w:bottom w:val="single" w:sz="4" w:space="0" w:color="E2E8F0"/>
+              <w:right w:val="single" w:sz="4" w:space="0" w:color="E2E8F0"/>
+            </w:tcBorders>
+          </w:tcPr>
+          <w:p>
+            <w:pPr>
+              <w:spacing w:after="0" w:line="276" w:lineRule="auto"/>
+              <w:jc w:val="center"/>
+            </w:pPr>
+            <w:r>
+              <w:rPr>
+                <w:rFonts w:ascii="Times New Roman" w:hAnsi="Times New Roman"/>
+                <w:color w:val="1F2937"/>
+                <w:sz w:val="20"/>
+              </w:rPr>
+              <w:t>26</w:t>
             </w:r>
           </w:p>
         </w:tc>
@@ -19510,13 +19872,37 @@
       </w:r>
     </w:p>
     <w:sectPr>
+      <w:footerReference w:type="default" r:id="rId9"/>
       <w:pgSz w:w="11909" w:h="16834"/>
       <w:pgMar w:top="1440" w:right="1440" w:bottom="1440" w:left="1440" w:header="720" w:footer="720" w:gutter="0"/>
       <w:cols w:space="720"/>
+      <w:titlePg/>
       <w:docGrid w:linePitch="360"/>
     </w:sectPr>
   </w:body>
 </w:document>
+</file>
+
+<file path=word/footer1.xml><?xml version="1.0" encoding="utf-8"?>
+<w:ftr xmlns:m="http://schemas.openxmlformats.org/officeDocument/2006/math" xmlns:mc="http://schemas.openxmlformats.org/markup-compatibility/2006" xmlns:mo="http://schemas.microsoft.com/office/mac/office/2008/main" xmlns:mv="urn:schemas-microsoft-com:mac:vml" xmlns:o="urn:schemas-microsoft-com:office:office" xmlns:r="http://schemas.openxmlformats.org/officeDocument/2006/relationships" xmlns:v="urn:schemas-microsoft-com:vml" xmlns:w10="urn:schemas-microsoft-com:office:word" xmlns:w14="http://schemas.microsoft.com/office/word/2010/wordml" xmlns:w="http://schemas.openxmlformats.org/wordprocessingml/2006/main" xmlns:wne="http://schemas.microsoft.com/office/word/2006/wordml" xmlns:wp14="http://schemas.microsoft.com/office/word/2010/wordprocessingDrawing" xmlns:wp="http://schemas.openxmlformats.org/drawingml/2006/wordprocessingDrawing" xmlns:wpc="http://schemas.microsoft.com/office/word/2010/wordprocessingCanvas" xmlns:wpg="http://schemas.microsoft.com/office/word/2010/wordprocessingGroup" xmlns:wpi="http://schemas.microsoft.com/office/word/2010/wordprocessingInk" xmlns:wps="http://schemas.microsoft.com/office/word/2010/wordprocessingShape" mc:Ignorable="w14 wp14">
+  <w:p>
+    <w:pPr>
+      <w:pStyle w:val="Footer"/>
+      <w:jc w:val="center"/>
+    </w:pPr>
+    <w:r>
+      <w:rPr>
+        <w:rFonts w:ascii="Times New Roman" w:hAnsi="Times New Roman"/>
+        <w:color w:val="374151"/>
+        <w:sz w:val="22"/>
+      </w:rPr>
+      <w:fldChar w:fldCharType="begin"/>
+      <w:instrText xml:space="preserve"> PAGE </w:instrText>
+      <w:fldChar w:fldCharType="separate"/>
+      <w:fldChar w:fldCharType="end"/>
+    </w:r>
+  </w:p>
+</w:ftr>
 </file>
 
 <file path=word/numbering.xml><?xml version="1.0" encoding="utf-8"?>

</xml_diff>